<commit_message>
Rilascio DOCUMENTAZIONE 12.6.4.0 2024-09-27
</commit_message>
<xml_diff>
--- a/MEV/SCHEDA_009/2019_09-SIEP-Originali/SIUT-SIES-PR-1.0-20240419-Piano_di_Rilascio_2019_009_SIEP_FASE-2_D.lgs.123-2018.docx
+++ b/MEV/SCHEDA_009/2019_09-SIEP-Originali/SIUT-SIES-PR-1.0-20240419-Piano_di_Rilascio_2019_009_SIEP_FASE-2_D.lgs.123-2018.docx
@@ -29,7 +29,6 @@
                 <w:lang w:eastAsia="en-US"/>
               </w:rPr>
             </w:pPr>
-            <w:bookmarkStart w:id="0" w:name="_GoBack"/>
             <w:r>
               <w:rPr>
                 <w:rFonts w:asciiTheme="minorHAnsi" w:hAnsiTheme="minorHAnsi" w:cstheme="minorHAnsi"/>
@@ -183,10 +182,10 @@
         </w:tc>
       </w:tr>
     </w:tbl>
-    <w:bookmarkStart w:id="1" w:name="_Hlk14967838" w:displacedByCustomXml="next"/>
-    <w:bookmarkEnd w:id="1" w:displacedByCustomXml="next"/>
+    <w:bookmarkStart w:id="0" w:name="_Hlk14967838" w:displacedByCustomXml="next"/>
+    <w:bookmarkEnd w:id="0" w:displacedByCustomXml="next"/>
+    <w:bookmarkStart w:id="1" w:name="_Hlk15306111" w:displacedByCustomXml="next"/>
     <w:bookmarkStart w:id="2" w:name="_Hlk10713674" w:displacedByCustomXml="next"/>
-    <w:bookmarkStart w:id="3" w:name="_Hlk15306111" w:displacedByCustomXml="next"/>
     <w:sdt>
       <w:sdtPr>
         <w:rPr>
@@ -582,12 +581,14 @@
           <w:lang w:eastAsia="ja-JP"/>
         </w:rPr>
       </w:pPr>
-      <w:bookmarkStart w:id="4" w:name="_Toc520005733"/>
-      <w:bookmarkStart w:id="5" w:name="_Toc419800866"/>
-      <w:bookmarkStart w:id="6" w:name="_Toc12544354"/>
-      <w:bookmarkStart w:id="7" w:name="_Toc21599121"/>
-      <w:bookmarkEnd w:id="3"/>
+      <w:bookmarkStart w:id="3" w:name="_Toc520005733"/>
+      <w:bookmarkStart w:id="4" w:name="_Toc419800866"/>
+      <w:bookmarkStart w:id="5" w:name="_Toc12544354"/>
+      <w:bookmarkStart w:id="6" w:name="_Toc21599121"/>
+      <w:bookmarkStart w:id="7" w:name="_GoBack"/>
       <w:bookmarkEnd w:id="2"/>
+      <w:bookmarkEnd w:id="1"/>
+      <w:bookmarkEnd w:id="7"/>
     </w:p>
     <w:p>
       <w:pPr>
@@ -3000,7 +3001,7 @@
         </w:rPr>
         <w:fldChar w:fldCharType="separate"/>
       </w:r>
-      <w:hyperlink w:anchor="_Toc164417955" w:history="1">
+      <w:hyperlink w:anchor="_Toc177647456" w:history="1">
         <w:r>
           <w:rPr>
             <w:rStyle w:val="Collegamentoipertestuale"/>
@@ -3047,7 +3048,7 @@
             <w:noProof/>
             <w:webHidden/>
           </w:rPr>
-          <w:instrText xml:space="preserve"> PAGEREF _Toc164417955 \h </w:instrText>
+          <w:instrText xml:space="preserve"> PAGEREF _Toc177647456 \h </w:instrText>
         </w:r>
         <w:r>
           <w:rPr>
@@ -3092,7 +3093,7 @@
           <w:szCs w:val="22"/>
         </w:rPr>
       </w:pPr>
-      <w:hyperlink w:anchor="_Toc164417956" w:history="1">
+      <w:hyperlink w:anchor="_Toc177647457" w:history="1">
         <w:r>
           <w:rPr>
             <w:rStyle w:val="Collegamentoipertestuale"/>
@@ -3132,7 +3133,7 @@
           <w:rPr>
             <w:webHidden/>
           </w:rPr>
-          <w:instrText xml:space="preserve"> PAGEREF _Toc164417956 \h </w:instrText>
+          <w:instrText xml:space="preserve"> PAGEREF _Toc177647457 \h </w:instrText>
         </w:r>
         <w:r>
           <w:rPr>
@@ -3173,7 +3174,7 @@
           <w:szCs w:val="22"/>
         </w:rPr>
       </w:pPr>
-      <w:hyperlink w:anchor="_Toc164417957" w:history="1">
+      <w:hyperlink w:anchor="_Toc177647458" w:history="1">
         <w:r>
           <w:rPr>
             <w:rStyle w:val="Collegamentoipertestuale"/>
@@ -3213,7 +3214,7 @@
           <w:rPr>
             <w:webHidden/>
           </w:rPr>
-          <w:instrText xml:space="preserve"> PAGEREF _Toc164417957 \h </w:instrText>
+          <w:instrText xml:space="preserve"> PAGEREF _Toc177647458 \h </w:instrText>
         </w:r>
         <w:r>
           <w:rPr>
@@ -3254,7 +3255,7 @@
           <w:szCs w:val="22"/>
         </w:rPr>
       </w:pPr>
-      <w:hyperlink w:anchor="_Toc164417958" w:history="1">
+      <w:hyperlink w:anchor="_Toc177647459" w:history="1">
         <w:r>
           <w:rPr>
             <w:rStyle w:val="Collegamentoipertestuale"/>
@@ -3294,7 +3295,7 @@
           <w:rPr>
             <w:webHidden/>
           </w:rPr>
-          <w:instrText xml:space="preserve"> PAGEREF _Toc164417958 \h </w:instrText>
+          <w:instrText xml:space="preserve"> PAGEREF _Toc177647459 \h </w:instrText>
         </w:r>
         <w:r>
           <w:rPr>
@@ -3335,7 +3336,7 @@
           <w:szCs w:val="22"/>
         </w:rPr>
       </w:pPr>
-      <w:hyperlink w:anchor="_Toc164417959" w:history="1">
+      <w:hyperlink w:anchor="_Toc177647460" w:history="1">
         <w:r>
           <w:rPr>
             <w:rStyle w:val="Collegamentoipertestuale"/>
@@ -3375,7 +3376,7 @@
           <w:rPr>
             <w:webHidden/>
           </w:rPr>
-          <w:instrText xml:space="preserve"> PAGEREF _Toc164417959 \h </w:instrText>
+          <w:instrText xml:space="preserve"> PAGEREF _Toc177647460 \h </w:instrText>
         </w:r>
         <w:r>
           <w:rPr>
@@ -3416,7 +3417,7 @@
           <w:szCs w:val="22"/>
         </w:rPr>
       </w:pPr>
-      <w:hyperlink w:anchor="_Toc164417960" w:history="1">
+      <w:hyperlink w:anchor="_Toc177647461" w:history="1">
         <w:r>
           <w:rPr>
             <w:rStyle w:val="Collegamentoipertestuale"/>
@@ -3456,7 +3457,7 @@
           <w:rPr>
             <w:webHidden/>
           </w:rPr>
-          <w:instrText xml:space="preserve"> PAGEREF _Toc164417960 \h </w:instrText>
+          <w:instrText xml:space="preserve"> PAGEREF _Toc177647461 \h </w:instrText>
         </w:r>
         <w:r>
           <w:rPr>
@@ -3499,7 +3500,7 @@
           <w:szCs w:val="22"/>
         </w:rPr>
       </w:pPr>
-      <w:hyperlink w:anchor="_Toc164417961" w:history="1">
+      <w:hyperlink w:anchor="_Toc177647462" w:history="1">
         <w:r>
           <w:rPr>
             <w:rStyle w:val="Collegamentoipertestuale"/>
@@ -3546,7 +3547,7 @@
             <w:noProof/>
             <w:webHidden/>
           </w:rPr>
-          <w:instrText xml:space="preserve"> PAGEREF _Toc164417961 \h </w:instrText>
+          <w:instrText xml:space="preserve"> PAGEREF _Toc177647462 \h </w:instrText>
         </w:r>
         <w:r>
           <w:rPr>
@@ -3593,7 +3594,7 @@
           <w:szCs w:val="22"/>
         </w:rPr>
       </w:pPr>
-      <w:hyperlink w:anchor="_Toc164417962" w:history="1">
+      <w:hyperlink w:anchor="_Toc177647463" w:history="1">
         <w:r>
           <w:rPr>
             <w:rStyle w:val="Collegamentoipertestuale"/>
@@ -3640,7 +3641,7 @@
             <w:noProof/>
             <w:webHidden/>
           </w:rPr>
-          <w:instrText xml:space="preserve"> PAGEREF _Toc164417962 \h </w:instrText>
+          <w:instrText xml:space="preserve"> PAGEREF _Toc177647463 \h </w:instrText>
         </w:r>
         <w:r>
           <w:rPr>
@@ -3687,7 +3688,7 @@
           <w:szCs w:val="22"/>
         </w:rPr>
       </w:pPr>
-      <w:hyperlink w:anchor="_Toc164417963" w:history="1">
+      <w:hyperlink w:anchor="_Toc177647464" w:history="1">
         <w:r>
           <w:rPr>
             <w:rStyle w:val="Collegamentoipertestuale"/>
@@ -3734,7 +3735,7 @@
             <w:noProof/>
             <w:webHidden/>
           </w:rPr>
-          <w:instrText xml:space="preserve"> PAGEREF _Toc164417963 \h </w:instrText>
+          <w:instrText xml:space="preserve"> PAGEREF _Toc177647464 \h </w:instrText>
         </w:r>
         <w:r>
           <w:rPr>
@@ -3779,7 +3780,7 @@
           <w:szCs w:val="22"/>
         </w:rPr>
       </w:pPr>
-      <w:hyperlink w:anchor="_Toc164417964" w:history="1">
+      <w:hyperlink w:anchor="_Toc177647465" w:history="1">
         <w:r>
           <w:rPr>
             <w:rStyle w:val="Collegamentoipertestuale"/>
@@ -3819,7 +3820,7 @@
           <w:rPr>
             <w:webHidden/>
           </w:rPr>
-          <w:instrText xml:space="preserve"> PAGEREF _Toc164417964 \h </w:instrText>
+          <w:instrText xml:space="preserve"> PAGEREF _Toc177647465 \h </w:instrText>
         </w:r>
         <w:r>
           <w:rPr>
@@ -3860,7 +3861,7 @@
           <w:szCs w:val="22"/>
         </w:rPr>
       </w:pPr>
-      <w:hyperlink w:anchor="_Toc164417965" w:history="1">
+      <w:hyperlink w:anchor="_Toc177647466" w:history="1">
         <w:r>
           <w:rPr>
             <w:rStyle w:val="Collegamentoipertestuale"/>
@@ -3900,7 +3901,7 @@
           <w:rPr>
             <w:webHidden/>
           </w:rPr>
-          <w:instrText xml:space="preserve"> PAGEREF _Toc164417965 \h </w:instrText>
+          <w:instrText xml:space="preserve"> PAGEREF _Toc177647466 \h </w:instrText>
         </w:r>
         <w:r>
           <w:rPr>
@@ -3943,7 +3944,7 @@
           <w:szCs w:val="22"/>
         </w:rPr>
       </w:pPr>
-      <w:hyperlink w:anchor="_Toc164417966" w:history="1">
+      <w:hyperlink w:anchor="_Toc177647467" w:history="1">
         <w:r>
           <w:rPr>
             <w:rStyle w:val="Collegamentoipertestuale"/>
@@ -3990,7 +3991,7 @@
             <w:noProof/>
             <w:webHidden/>
           </w:rPr>
-          <w:instrText xml:space="preserve"> PAGEREF _Toc164417966 \h </w:instrText>
+          <w:instrText xml:space="preserve"> PAGEREF _Toc177647467 \h </w:instrText>
         </w:r>
         <w:r>
           <w:rPr>
@@ -4037,7 +4038,7 @@
           <w:szCs w:val="22"/>
         </w:rPr>
       </w:pPr>
-      <w:hyperlink w:anchor="_Toc164417967" w:history="1">
+      <w:hyperlink w:anchor="_Toc177647468" w:history="1">
         <w:r>
           <w:rPr>
             <w:rStyle w:val="Collegamentoipertestuale"/>
@@ -4084,7 +4085,7 @@
             <w:noProof/>
             <w:webHidden/>
           </w:rPr>
-          <w:instrText xml:space="preserve"> PAGEREF _Toc164417967 \h </w:instrText>
+          <w:instrText xml:space="preserve"> PAGEREF _Toc177647468 \h </w:instrText>
         </w:r>
         <w:r>
           <w:rPr>
@@ -4129,7 +4130,7 @@
           <w:szCs w:val="22"/>
         </w:rPr>
       </w:pPr>
-      <w:hyperlink w:anchor="_Toc164417968" w:history="1">
+      <w:hyperlink w:anchor="_Toc177647469" w:history="1">
         <w:r>
           <w:rPr>
             <w:rStyle w:val="Collegamentoipertestuale"/>
@@ -4169,7 +4170,7 @@
           <w:rPr>
             <w:webHidden/>
           </w:rPr>
-          <w:instrText xml:space="preserve"> PAGEREF _Toc164417968 \h </w:instrText>
+          <w:instrText xml:space="preserve"> PAGEREF _Toc177647469 \h </w:instrText>
         </w:r>
         <w:r>
           <w:rPr>
@@ -4210,7 +4211,7 @@
           <w:szCs w:val="22"/>
         </w:rPr>
       </w:pPr>
-      <w:hyperlink w:anchor="_Toc164417969" w:history="1">
+      <w:hyperlink w:anchor="_Toc177647470" w:history="1">
         <w:r>
           <w:rPr>
             <w:rStyle w:val="Collegamentoipertestuale"/>
@@ -4250,7 +4251,7 @@
           <w:rPr>
             <w:webHidden/>
           </w:rPr>
-          <w:instrText xml:space="preserve"> PAGEREF _Toc164417969 \h </w:instrText>
+          <w:instrText xml:space="preserve"> PAGEREF _Toc177647470 \h </w:instrText>
         </w:r>
         <w:r>
           <w:rPr>
@@ -4291,7 +4292,7 @@
           <w:szCs w:val="22"/>
         </w:rPr>
       </w:pPr>
-      <w:hyperlink w:anchor="_Toc164417970" w:history="1">
+      <w:hyperlink w:anchor="_Toc177647471" w:history="1">
         <w:r>
           <w:rPr>
             <w:rStyle w:val="Collegamentoipertestuale"/>
@@ -4331,7 +4332,7 @@
           <w:rPr>
             <w:webHidden/>
           </w:rPr>
-          <w:instrText xml:space="preserve"> PAGEREF _Toc164417970 \h </w:instrText>
+          <w:instrText xml:space="preserve"> PAGEREF _Toc177647471 \h </w:instrText>
         </w:r>
         <w:r>
           <w:rPr>
@@ -4372,7 +4373,7 @@
           <w:szCs w:val="22"/>
         </w:rPr>
       </w:pPr>
-      <w:hyperlink w:anchor="_Toc164417971" w:history="1">
+      <w:hyperlink w:anchor="_Toc177647472" w:history="1">
         <w:r>
           <w:rPr>
             <w:rStyle w:val="Collegamentoipertestuale"/>
@@ -4412,7 +4413,7 @@
           <w:rPr>
             <w:webHidden/>
           </w:rPr>
-          <w:instrText xml:space="preserve"> PAGEREF _Toc164417971 \h </w:instrText>
+          <w:instrText xml:space="preserve"> PAGEREF _Toc177647472 \h </w:instrText>
         </w:r>
         <w:r>
           <w:rPr>
@@ -4453,7 +4454,7 @@
           <w:szCs w:val="22"/>
         </w:rPr>
       </w:pPr>
-      <w:hyperlink w:anchor="_Toc164417972" w:history="1">
+      <w:hyperlink w:anchor="_Toc177647473" w:history="1">
         <w:r>
           <w:rPr>
             <w:rStyle w:val="Collegamentoipertestuale"/>
@@ -4493,7 +4494,7 @@
           <w:rPr>
             <w:webHidden/>
           </w:rPr>
-          <w:instrText xml:space="preserve"> PAGEREF _Toc164417972 \h </w:instrText>
+          <w:instrText xml:space="preserve"> PAGEREF _Toc177647473 \h </w:instrText>
         </w:r>
         <w:r>
           <w:rPr>
@@ -4534,7 +4535,7 @@
           <w:szCs w:val="22"/>
         </w:rPr>
       </w:pPr>
-      <w:hyperlink w:anchor="_Toc164417973" w:history="1">
+      <w:hyperlink w:anchor="_Toc177647474" w:history="1">
         <w:r>
           <w:rPr>
             <w:rStyle w:val="Collegamentoipertestuale"/>
@@ -4574,7 +4575,7 @@
           <w:rPr>
             <w:webHidden/>
           </w:rPr>
-          <w:instrText xml:space="preserve"> PAGEREF _Toc164417973 \h </w:instrText>
+          <w:instrText xml:space="preserve"> PAGEREF _Toc177647474 \h </w:instrText>
         </w:r>
         <w:r>
           <w:rPr>
@@ -4615,7 +4616,7 @@
           <w:szCs w:val="22"/>
         </w:rPr>
       </w:pPr>
-      <w:hyperlink w:anchor="_Toc164417974" w:history="1">
+      <w:hyperlink w:anchor="_Toc177647475" w:history="1">
         <w:r>
           <w:rPr>
             <w:rStyle w:val="Collegamentoipertestuale"/>
@@ -4655,7 +4656,7 @@
           <w:rPr>
             <w:webHidden/>
           </w:rPr>
-          <w:instrText xml:space="preserve"> PAGEREF _Toc164417974 \h </w:instrText>
+          <w:instrText xml:space="preserve"> PAGEREF _Toc177647475 \h </w:instrText>
         </w:r>
         <w:r>
           <w:rPr>
@@ -4696,7 +4697,7 @@
           <w:szCs w:val="22"/>
         </w:rPr>
       </w:pPr>
-      <w:hyperlink w:anchor="_Toc164417975" w:history="1">
+      <w:hyperlink w:anchor="_Toc177647476" w:history="1">
         <w:r>
           <w:rPr>
             <w:rStyle w:val="Collegamentoipertestuale"/>
@@ -4736,7 +4737,7 @@
           <w:rPr>
             <w:webHidden/>
           </w:rPr>
-          <w:instrText xml:space="preserve"> PAGEREF _Toc164417975 \h </w:instrText>
+          <w:instrText xml:space="preserve"> PAGEREF _Toc177647476 \h </w:instrText>
         </w:r>
         <w:r>
           <w:rPr>
@@ -4777,7 +4778,7 @@
           <w:szCs w:val="22"/>
         </w:rPr>
       </w:pPr>
-      <w:hyperlink w:anchor="_Toc164417976" w:history="1">
+      <w:hyperlink w:anchor="_Toc177647477" w:history="1">
         <w:r>
           <w:rPr>
             <w:rStyle w:val="Collegamentoipertestuale"/>
@@ -4817,7 +4818,7 @@
           <w:rPr>
             <w:webHidden/>
           </w:rPr>
-          <w:instrText xml:space="preserve"> PAGEREF _Toc164417976 \h </w:instrText>
+          <w:instrText xml:space="preserve"> PAGEREF _Toc177647477 \h </w:instrText>
         </w:r>
         <w:r>
           <w:rPr>
@@ -4907,7 +4908,7 @@
       </w:pPr>
       <w:bookmarkStart w:id="13" w:name="_Toc330316535"/>
       <w:bookmarkStart w:id="14" w:name="_Toc8205263"/>
-      <w:bookmarkStart w:id="15" w:name="_Toc164417955"/>
+      <w:bookmarkStart w:id="15" w:name="_Toc177647456"/>
       <w:bookmarkEnd w:id="12"/>
       <w:r>
         <w:rPr>
@@ -4945,7 +4946,7 @@
       </w:pPr>
       <w:bookmarkStart w:id="16" w:name="_Toc330316536"/>
       <w:bookmarkStart w:id="17" w:name="_Toc8205264"/>
-      <w:bookmarkStart w:id="18" w:name="_Toc164417956"/>
+      <w:bookmarkStart w:id="18" w:name="_Toc177647457"/>
       <w:r>
         <w:rPr>
           <w:rFonts w:asciiTheme="minorHAnsi" w:hAnsiTheme="minorHAnsi" w:cstheme="minorHAnsi"/>
@@ -5107,7 +5108,7 @@
           <w:sz w:val="22"/>
           <w:szCs w:val="22"/>
         </w:rPr>
-        <w:t>12.5.7.0-MEV_2019_09_SIEP_FASE-2</w:t>
+        <w:t>12.6.2.0-MEV_2019_09_SIEP_FASE-2</w:t>
       </w:r>
       <w:r>
         <w:rPr>
@@ -5209,7 +5210,7 @@
         </w:rPr>
       </w:pPr>
       <w:bookmarkStart w:id="19" w:name="_Toc16251723"/>
-      <w:bookmarkStart w:id="20" w:name="_Toc164417957"/>
+      <w:bookmarkStart w:id="20" w:name="_Toc177647458"/>
       <w:r>
         <w:rPr>
           <w:rFonts w:asciiTheme="minorHAnsi" w:hAnsiTheme="minorHAnsi" w:cstheme="minorHAnsi"/>
@@ -5437,7 +5438,7 @@
           <w:szCs w:val="24"/>
         </w:rPr>
       </w:pPr>
-      <w:bookmarkStart w:id="21" w:name="_Toc164417958"/>
+      <w:bookmarkStart w:id="21" w:name="_Toc177647459"/>
       <w:r>
         <w:rPr>
           <w:rFonts w:asciiTheme="minorHAnsi" w:hAnsiTheme="minorHAnsi" w:cstheme="minorHAnsi"/>
@@ -5467,7 +5468,7 @@
           <w:szCs w:val="24"/>
         </w:rPr>
       </w:pPr>
-      <w:bookmarkStart w:id="22" w:name="_Toc164417959"/>
+      <w:bookmarkStart w:id="22" w:name="_Toc177647460"/>
       <w:r>
         <w:rPr>
           <w:rFonts w:asciiTheme="minorHAnsi" w:hAnsiTheme="minorHAnsi" w:cstheme="minorHAnsi"/>
@@ -5615,7 +5616,7 @@
           <w:szCs w:val="24"/>
         </w:rPr>
       </w:pPr>
-      <w:bookmarkStart w:id="23" w:name="_Toc164417960"/>
+      <w:bookmarkStart w:id="23" w:name="_Toc177647461"/>
       <w:r>
         <w:rPr>
           <w:rFonts w:asciiTheme="minorHAnsi" w:hAnsiTheme="minorHAnsi" w:cstheme="minorHAnsi"/>
@@ -6717,7 +6718,7 @@
       <w:bookmarkStart w:id="25" w:name="_Ref130988974"/>
       <w:bookmarkStart w:id="26" w:name="_Ref130989196"/>
       <w:bookmarkStart w:id="27" w:name="_Ref130989203"/>
-      <w:bookmarkStart w:id="28" w:name="_Toc164417961"/>
+      <w:bookmarkStart w:id="28" w:name="_Toc177647462"/>
       <w:r>
         <w:rPr>
           <w:rFonts w:asciiTheme="minorHAnsi" w:hAnsiTheme="minorHAnsi" w:cstheme="minorHAnsi"/>
@@ -6728,10 +6729,10 @@
         <w:lastRenderedPageBreak/>
         <w:t>Generalità</w:t>
       </w:r>
+      <w:bookmarkEnd w:id="3"/>
       <w:bookmarkEnd w:id="4"/>
       <w:bookmarkEnd w:id="5"/>
       <w:bookmarkEnd w:id="6"/>
-      <w:bookmarkEnd w:id="7"/>
       <w:bookmarkEnd w:id="24"/>
       <w:bookmarkEnd w:id="25"/>
       <w:bookmarkEnd w:id="26"/>
@@ -6923,7 +6924,7 @@
           <w:sz w:val="22"/>
           <w:szCs w:val="22"/>
         </w:rPr>
-        <w:t>12.5.7.0</w:t>
+        <w:t>12.6.2.0</w:t>
       </w:r>
       <w:r>
         <w:rPr>
@@ -7003,7 +7004,7 @@
       <w:bookmarkStart w:id="30" w:name="_Toc419800867"/>
       <w:bookmarkStart w:id="31" w:name="_Toc12544355"/>
       <w:bookmarkStart w:id="32" w:name="_Toc21599122"/>
-      <w:bookmarkStart w:id="33" w:name="_Toc164417962"/>
+      <w:bookmarkStart w:id="33" w:name="_Toc177647463"/>
       <w:r>
         <w:rPr>
           <w:rFonts w:asciiTheme="minorHAnsi" w:hAnsiTheme="minorHAnsi" w:cstheme="minorHAnsi"/>
@@ -7252,11 +7253,21 @@
             <w:pPr>
               <w:pStyle w:val="NormTab"/>
             </w:pPr>
-            <w:fldSimple w:instr=" DOCPROPERTY  Versione  \* MERGEFORMAT ">
-              <w:r>
-                <w:t>1.0</w:t>
-              </w:r>
-            </w:fldSimple>
+            <w:r>
+              <w:fldChar w:fldCharType="begin"/>
+            </w:r>
+            <w:r>
+              <w:instrText xml:space="preserve"> DOCPROPERTY  Versione  \* MERGEFORMAT </w:instrText>
+            </w:r>
+            <w:r>
+              <w:fldChar w:fldCharType="separate"/>
+            </w:r>
+            <w:r>
+              <w:t>1.0</w:t>
+            </w:r>
+            <w:r>
+              <w:fldChar w:fldCharType="end"/>
+            </w:r>
           </w:p>
         </w:tc>
         <w:tc>
@@ -7267,11 +7278,21 @@
             <w:pPr>
               <w:pStyle w:val="NormTab"/>
             </w:pPr>
-            <w:fldSimple w:instr=" DOCPROPERTY  &quot;Data Rilascio&quot;  \* MERGEFORMAT ">
-              <w:r>
-                <w:t>19/04/2024</w:t>
-              </w:r>
-            </w:fldSimple>
+            <w:r>
+              <w:fldChar w:fldCharType="begin"/>
+            </w:r>
+            <w:r>
+              <w:instrText xml:space="preserve"> DOCPROPERTY  "Data Rilascio"  \* MERGEFORMAT </w:instrText>
+            </w:r>
+            <w:r>
+              <w:fldChar w:fldCharType="separate"/>
+            </w:r>
+            <w:r>
+              <w:t>19/04/2024</w:t>
+            </w:r>
+            <w:r>
+              <w:fldChar w:fldCharType="end"/>
+            </w:r>
           </w:p>
         </w:tc>
       </w:tr>
@@ -7345,7 +7366,7 @@
       <w:bookmarkStart w:id="35" w:name="_Toc419800868"/>
       <w:bookmarkStart w:id="36" w:name="_Toc12544356"/>
       <w:bookmarkStart w:id="37" w:name="_Toc21599123"/>
-      <w:bookmarkStart w:id="38" w:name="_Toc164417963"/>
+      <w:bookmarkStart w:id="38" w:name="_Toc177647464"/>
       <w:r>
         <w:rPr>
           <w:rFonts w:asciiTheme="minorHAnsi" w:hAnsiTheme="minorHAnsi" w:cstheme="minorHAnsi"/>
@@ -7386,7 +7407,7 @@
       <w:bookmarkStart w:id="40" w:name="_Toc419800870"/>
       <w:bookmarkStart w:id="41" w:name="_Ref13214549"/>
       <w:bookmarkStart w:id="42" w:name="_Toc26961269"/>
-      <w:bookmarkStart w:id="43" w:name="_Toc164417964"/>
+      <w:bookmarkStart w:id="43" w:name="_Toc177647465"/>
       <w:r>
         <w:rPr>
           <w:rFonts w:asciiTheme="minorHAnsi" w:hAnsiTheme="minorHAnsi" w:cstheme="minorHAnsi"/>
@@ -7803,7 +7824,7 @@
         </w:rPr>
       </w:pPr>
       <w:bookmarkStart w:id="46" w:name="_Toc26961270"/>
-      <w:bookmarkStart w:id="47" w:name="_Toc164417965"/>
+      <w:bookmarkStart w:id="47" w:name="_Toc177647466"/>
       <w:r>
         <w:rPr>
           <w:rFonts w:asciiTheme="minorHAnsi" w:hAnsiTheme="minorHAnsi" w:cstheme="minorHAnsi"/>
@@ -8209,7 +8230,7 @@
       <w:bookmarkStart w:id="49" w:name="_Toc419800872"/>
       <w:bookmarkStart w:id="50" w:name="_Toc12544360"/>
       <w:bookmarkStart w:id="51" w:name="_Toc21599124"/>
-      <w:bookmarkStart w:id="52" w:name="_Toc164417966"/>
+      <w:bookmarkStart w:id="52" w:name="_Toc177647467"/>
       <w:bookmarkEnd w:id="44"/>
       <w:bookmarkEnd w:id="45"/>
       <w:bookmarkEnd w:id="46"/>
@@ -9767,7 +9788,7 @@
       <w:bookmarkStart w:id="54" w:name="_Toc419800873"/>
       <w:bookmarkStart w:id="55" w:name="_Toc12544361"/>
       <w:bookmarkStart w:id="56" w:name="_Toc21599125"/>
-      <w:bookmarkStart w:id="57" w:name="_Toc164417967"/>
+      <w:bookmarkStart w:id="57" w:name="_Toc177647468"/>
       <w:r>
         <w:rPr>
           <w:rFonts w:asciiTheme="minorHAnsi" w:hAnsiTheme="minorHAnsi" w:cstheme="minorHAnsi"/>
@@ -9804,7 +9825,7 @@
         </w:rPr>
       </w:pPr>
       <w:bookmarkStart w:id="58" w:name="_Toc38010748"/>
-      <w:bookmarkStart w:id="59" w:name="_Toc164417968"/>
+      <w:bookmarkStart w:id="59" w:name="_Toc177647469"/>
       <w:r>
         <w:rPr>
           <w:rFonts w:asciiTheme="minorHAnsi" w:hAnsiTheme="minorHAnsi" w:cstheme="minorHAnsi"/>
@@ -9888,7 +9909,7 @@
           <w:sz w:val="22"/>
           <w:szCs w:val="22"/>
         </w:rPr>
-        <w:t>12.5.7.0</w:t>
+        <w:t>12.6.2.0</w:t>
       </w:r>
       <w:r>
         <w:rPr>
@@ -9927,7 +9948,7 @@
         </w:rPr>
       </w:pPr>
       <w:bookmarkStart w:id="61" w:name="_Toc130471882"/>
-      <w:bookmarkStart w:id="62" w:name="_Toc164417969"/>
+      <w:bookmarkStart w:id="62" w:name="_Toc177647470"/>
       <w:bookmarkEnd w:id="60"/>
       <w:r>
         <w:rPr>
@@ -10173,7 +10194,7 @@
       </w:pPr>
       <w:bookmarkStart w:id="63" w:name="_Toc130471883"/>
       <w:bookmarkStart w:id="64" w:name="_Toc27745470"/>
-      <w:bookmarkStart w:id="65" w:name="_Toc164417970"/>
+      <w:bookmarkStart w:id="65" w:name="_Toc177647471"/>
       <w:r>
         <w:rPr>
           <w:rFonts w:asciiTheme="minorHAnsi" w:hAnsiTheme="minorHAnsi" w:cstheme="minorHAnsi"/>
@@ -10223,7 +10244,7 @@
         </w:rPr>
       </w:pPr>
       <w:bookmarkStart w:id="66" w:name="_Toc130471884"/>
-      <w:bookmarkStart w:id="67" w:name="_Toc164417971"/>
+      <w:bookmarkStart w:id="67" w:name="_Toc177647472"/>
       <w:r>
         <w:rPr>
           <w:rFonts w:asciiTheme="minorHAnsi" w:hAnsiTheme="minorHAnsi" w:cstheme="minorHAnsi"/>
@@ -10271,7 +10292,7 @@
       <w:bookmarkStart w:id="68" w:name="_Toc27745471"/>
       <w:bookmarkStart w:id="69" w:name="_Toc130471885"/>
       <w:bookmarkStart w:id="70" w:name="_Hlk38463154"/>
-      <w:bookmarkStart w:id="71" w:name="_Toc164417972"/>
+      <w:bookmarkStart w:id="71" w:name="_Toc177647473"/>
       <w:r>
         <w:rPr>
           <w:rFonts w:asciiTheme="minorHAnsi" w:hAnsiTheme="minorHAnsi" w:cstheme="minorHAnsi"/>
@@ -11864,7 +11885,7 @@
       <w:bookmarkStart w:id="72" w:name="_Toc27745472"/>
       <w:bookmarkStart w:id="73" w:name="_Toc130471886"/>
       <w:bookmarkStart w:id="74" w:name="_Hlk38463271"/>
-      <w:bookmarkStart w:id="75" w:name="_Toc164417973"/>
+      <w:bookmarkStart w:id="75" w:name="_Toc177647474"/>
       <w:r>
         <w:rPr>
           <w:rFonts w:asciiTheme="minorHAnsi" w:hAnsiTheme="minorHAnsi" w:cstheme="minorHAnsi"/>
@@ -11908,7 +11929,7 @@
       <w:bookmarkStart w:id="80" w:name="_Ref130989110"/>
       <w:bookmarkStart w:id="81" w:name="_Ref130989115"/>
       <w:bookmarkStart w:id="82" w:name="_Ref130989124"/>
-      <w:bookmarkStart w:id="83" w:name="_Toc164417974"/>
+      <w:bookmarkStart w:id="83" w:name="_Toc177647475"/>
       <w:bookmarkEnd w:id="74"/>
       <w:r>
         <w:rPr>
@@ -12760,7 +12781,7 @@
           <w:szCs w:val="24"/>
         </w:rPr>
       </w:pPr>
-      <w:bookmarkStart w:id="84" w:name="_Toc164417975"/>
+      <w:bookmarkStart w:id="84" w:name="_Toc177647476"/>
       <w:r>
         <w:rPr>
           <w:rFonts w:asciiTheme="minorHAnsi" w:hAnsiTheme="minorHAnsi" w:cstheme="minorHAnsi"/>
@@ -12814,7 +12835,7 @@
           <w:szCs w:val="24"/>
         </w:rPr>
       </w:pPr>
-      <w:bookmarkStart w:id="85" w:name="_Toc164417976"/>
+      <w:bookmarkStart w:id="85" w:name="_Toc177647477"/>
       <w:r>
         <w:rPr>
           <w:rFonts w:asciiTheme="minorHAnsi" w:hAnsiTheme="minorHAnsi" w:cstheme="minorHAnsi"/>
@@ -12843,7 +12864,6 @@
         </w:rPr>
         <w:t>.</w:t>
       </w:r>
-      <w:bookmarkEnd w:id="0"/>
     </w:p>
     <w:sectPr>
       <w:headerReference w:type="default" r:id="rId10"/>
@@ -13177,7 +13197,7 @@
               <w:sz w:val="16"/>
               <w:szCs w:val="22"/>
             </w:rPr>
-            <w:t>9</w:t>
+            <w:t>12</w:t>
           </w:r>
           <w:r>
             <w:rPr>
@@ -20631,7 +20651,7 @@
 </file>
 
 <file path=customXml/itemProps1.xml><?xml version="1.0" encoding="utf-8"?>
-<ds:datastoreItem xmlns:ds="http://schemas.openxmlformats.org/officeDocument/2006/customXml" ds:itemID="{F7BF183A-F366-433D-80FC-214786252F88}">
+<ds:datastoreItem xmlns:ds="http://schemas.openxmlformats.org/officeDocument/2006/customXml" ds:itemID="{2A8C8AAA-FA60-4218-8E60-B0D8CD1C603C}">
   <ds:schemaRefs>
     <ds:schemaRef ds:uri="http://schemas.openxmlformats.org/officeDocument/2006/bibliography"/>
   </ds:schemaRefs>

</xml_diff>